<commit_message>
feat(creators): creator flow and approved notes
</commit_message>
<xml_diff>
--- a/Glad_U_Came_Creator_Enquiries_Questionnaire.docx
+++ b/Glad_U_Came_Creator_Enquiries_Questionnaire.docx
@@ -64,69 +64,9 @@
         <w:t xml:space="preserve">Hi Maddie, to automate creator and influencer enquiries the same way we did for brand enquiries, we need a few details from your side. Short answers or bullet points are fine, and real examples help the most. You can type straight into the boxes below.</w:t>
       </w:r>
     </w:p>
-    <w:tbl>
-      <w:tblPr>
-        <w:tblW w:type="dxa" w:w="9026"/>
-        <w:tblBorders>
-          <w:top w:val="single" w:color="auto" w:sz="4"/>
-          <w:left w:val="single" w:color="auto" w:sz="4"/>
-          <w:bottom w:val="single" w:color="auto" w:sz="4"/>
-          <w:right w:val="single" w:color="auto" w:sz="4"/>
-          <w:insideH w:val="single" w:color="auto" w:sz="4"/>
-          <w:insideV w:val="single" w:color="auto" w:sz="4"/>
-        </w:tblBorders>
-      </w:tblPr>
-      <w:tblGrid>
-        <w:gridCol w:w="9026"/>
-      </w:tblGrid>
-      <w:tr>
-        <w:trPr>
-          <w:cantSplit/>
-        </w:trPr>
-        <w:tc>
-          <w:tcPr>
-            <w:tcW w:type="dxa" w:w="9026"/>
-            <w:tcBorders>
-              <w:top w:val="none" w:color="FFFFFF" w:sz="0"/>
-              <w:left w:val="single" w:color="C2255C" w:sz="24"/>
-              <w:bottom w:val="none" w:color="FFFFFF" w:sz="0"/>
-              <w:right w:val="none" w:color="FFFFFF" w:sz="0"/>
-            </w:tcBorders>
-            <w:shd w:fill="FDEBF1" w:color="auto" w:val="clear"/>
-            <w:tcMar>
-              <w:top w:type="dxa" w:w="140"/>
-              <w:left w:type="dxa" w:w="200"/>
-              <w:bottom w:type="dxa" w:w="140"/>
-              <w:right w:type="dxa" w:w="200"/>
-            </w:tcMar>
-          </w:tcPr>
-          <w:p>
-            <w:pPr>
-              <w:spacing w:line="290"/>
-            </w:pPr>
-            <w:r>
-              <w:rPr>
-                <w:rFonts w:ascii="Calibri" w:cs="Calibri" w:eastAsia="Calibri" w:hAnsi="Calibri"/>
-                <w:b/>
-                <w:bCs/>
-                <w:color w:val="1F1B2E"/>
-              </w:rPr>
-              <w:t xml:space="preserve">If time is short: </w:t>
-            </w:r>
-            <w:r>
-              <w:rPr>
-                <w:rFonts w:ascii="Calibri" w:cs="Calibri" w:eastAsia="Calibri" w:hAnsi="Calibri"/>
-                <w:color w:val="1F1B2E"/>
-              </w:rPr>
-              <w:t xml:space="preserve">the answers that matter most are the roster criteria in section 2, the details to collect in section 3, the rates rule in section 4, the sample replies in section 7 and the team names in section 8. We can launch a first version with those and refine the rest later.</w:t>
-            </w:r>
-          </w:p>
-        </w:tc>
-      </w:tr>
-    </w:tbl>
-    <w:p>
-      <w:pPr>
-        <w:spacing w:after="120"/>
+    <w:p>
+      <w:pPr>
+        <w:spacing w:after="60"/>
       </w:pPr>
     </w:p>
     <w:p>
@@ -256,7 +196,7 @@
           </w:tcPr>
           <w:p>
             <w:pPr>
-              <w:spacing w:after="700"/>
+              <w:spacing w:after="420"/>
             </w:pPr>
             <w:r>
               <w:rPr>
@@ -418,7 +358,7 @@
           </w:tcPr>
           <w:p>
             <w:pPr>
-              <w:spacing w:after="700"/>
+              <w:spacing w:after="420"/>
             </w:pPr>
             <w:r>
               <w:rPr>
@@ -562,7 +502,7 @@
           </w:tcPr>
           <w:p>
             <w:pPr>
-              <w:spacing w:after="700"/>
+              <w:spacing w:after="420"/>
             </w:pPr>
             <w:r>
               <w:rPr>
@@ -706,7 +646,7 @@
           </w:tcPr>
           <w:p>
             <w:pPr>
-              <w:spacing w:after="700"/>
+              <w:spacing w:after="420"/>
             </w:pPr>
             <w:r>
               <w:rPr>
@@ -868,7 +808,7 @@
           </w:tcPr>
           <w:p>
             <w:pPr>
-              <w:spacing w:after="700"/>
+              <w:spacing w:after="420"/>
             </w:pPr>
             <w:r>
               <w:rPr>
@@ -994,7 +934,7 @@
           </w:tcPr>
           <w:p>
             <w:pPr>
-              <w:spacing w:after="700"/>
+              <w:spacing w:after="420"/>
             </w:pPr>
             <w:r>
               <w:rPr>
@@ -1156,7 +1096,7 @@
           </w:tcPr>
           <w:p>
             <w:pPr>
-              <w:spacing w:after="700"/>
+              <w:spacing w:after="420"/>
             </w:pPr>
             <w:r>
               <w:rPr>
@@ -1318,7 +1258,7 @@
           </w:tcPr>
           <w:p>
             <w:pPr>
-              <w:spacing w:after="700"/>
+              <w:spacing w:after="420"/>
             </w:pPr>
             <w:r>
               <w:rPr>
@@ -1337,7 +1277,7 @@
     </w:tbl>
     <w:p>
       <w:pPr>
-        <w:spacing w:before="300"/>
+        <w:spacing w:before="200"/>
       </w:pPr>
       <w:r>
         <w:rPr>
@@ -1350,7 +1290,7 @@
     <w:sectPr>
       <w:footerReference w:type="default" r:id="rId7"/>
       <w:pgSz w:w="11906" w:h="16838" w:orient="portrait"/>
-      <w:pgMar w:top="1300" w:right="1440" w:bottom="1300" w:left="1440" w:header="708" w:footer="708" w:gutter="0"/>
+      <w:pgMar w:top="1100" w:right="1440" w:bottom="1100" w:left="1440" w:header="708" w:footer="708" w:gutter="0"/>
       <w:pgNumType/>
       <w:docGrid w:linePitch="360"/>
     </w:sectPr>

</xml_diff>